<commit_message>
docs(paper): rev2 — fold backlog close-out into briefing + paper (docx + tex)
Mem0 same-judge row (we lead every category, temporal +32.7pp), token Pareto
(Config D -28% at 85.32; <=1500 costs -11pp, lanes load-bearing), PR #14 merged
(OSS carries winning stack), LME guard (no regression), Zep+LangMem literature-sourced
per founder decision. Team briefing + paper docx regenerated & validated; tex synced.
</commit_message>
<xml_diff>
--- a/docs/paper/2026-06-12-locomo-sota-paper-draft.docx
+++ b/docs/paper/2026-06-12-locomo-sota-paper-draft.docx
@@ -43,7 +43,7 @@
           <w:sz w:val="18"/>
           <w:szCs w:val="18"/>
         </w:rPr>
-        <w:t xml:space="preserve">June 2026 — DRAFT v0.1 (readable .docx companion to the LaTeX source; not yet submitted)</w:t>
+        <w:t xml:space="preserve">June 2026 — DRAFT v0.2 (readable .docx; Mem0 same-judge + token Pareto folded in; not yet submitted)</w:t>
       </w:r>
     </w:p>
     <w:p>
@@ -70,7 +70,7 @@
         <w:t xml:space="preserve">87.66% overall — +5.71pp above the best previously published memory system (Memori, 81.95%; one-sample z=4.42, p&lt;10⁻⁵)</w:t>
       </w:r>
       <w:r>
-        <w:t xml:space="preserve"> — and leads or ties every question category among memory systems, with open-domain accuracy statistically indistinguishable from the full-context ceiling. We reproduce Memori’s own pipeline to within 0.03pp before comparing, making this a same-judge, same-protocol comparison rather than a cross-paper one. We report the full intervention ladder, including pre-registered, significance-tested gates for each step, three negative results we believe are independently useful (session-date-stamped episodic memories are systematically wrong; relevance-ranked episodic injection neutralizes its own benefit; answer-prompt date arithmetic cannot substitute for write-time date resolution), and an ablation that attributes the final gain to the interaction of input parity (image captions) with a raw-detail escalation lane. We also document a column-scrambling error in the baseline table of the Memori paper that has propagated through recent literature, and re-derive the corrected field. The substrate, including the benchmark harness, is open source. Token cost (3,747 tokens/question vs. Memori’s 1,294) remains the one axis where prior work dominates; we discuss the planned packing work.</w:t>
+        <w:t xml:space="preserve"> — and leads or ties every question category among memory systems, with open-domain accuracy statistically indistinguishable from the full-context ceiling. We reproduce Memori’s own pipeline to within 0.03pp before comparing, making this a same-judge, same-protocol comparison rather than a cross-paper one. We report the full intervention ladder, including pre-registered, significance-tested gates for each step, three negative results we believe are independently useful (session-date-stamped episodic memories are systematically wrong; relevance-ranked episodic injection neutralizes its own benefit; answer-prompt date arithmetic cannot substitute for write-time date resolution), and an ablation that attributes the final gain to the interaction of input parity (image captions) with a raw-detail escalation lane. We also document a column-scrambling error in the baseline table of the Memori paper that has propagated through recent literature, and re-derive the corrected field; and we re-run Mem0 under our own judge, where we lead every category (overall +13.7pp, temporal +32.7pp). The substrate, including the benchmark harness, is open source. On token cost (3,747 vs. Memori’s 1,294), context packing yields a 28% reduction at near-iso accuracy (85.3%), but matching the prior budget exactly costs ~11pp — the retrieval lanes are load-bearing.</w:t>
       </w:r>
     </w:p>
     <w:p>
@@ -3128,7 +3128,7 @@
                 <w:sz w:val="17"/>
                 <w:szCs w:val="17"/>
               </w:rPr>
-              <w:t xml:space="preserve">Memori</w:t>
+              <w:t xml:space="preserve">Memori (same-judge)</w:t>
             </w:r>
           </w:p>
         </w:tc>
@@ -3321,7 +3321,7 @@
                 <w:sz w:val="17"/>
                 <w:szCs w:val="17"/>
               </w:rPr>
-              <w:t xml:space="preserve">Zep †</w:t>
+              <w:t xml:space="preserve">Mem0 (same-judge, ours) ‡</w:t>
             </w:r>
           </w:p>
         </w:tc>
@@ -3352,7 +3352,7 @@
                 <w:sz w:val="17"/>
                 <w:szCs w:val="17"/>
               </w:rPr>
-              <w:t xml:space="preserve">83.49</w:t>
+              <w:t xml:space="preserve">83.59</w:t>
             </w:r>
           </w:p>
         </w:tc>
@@ -3383,7 +3383,7 @@
                 <w:sz w:val="17"/>
                 <w:szCs w:val="17"/>
               </w:rPr>
-              <w:t xml:space="preserve">72.34</w:t>
+              <w:t xml:space="preserve">74.82</w:t>
             </w:r>
           </w:p>
         </w:tc>
@@ -3414,7 +3414,7 @@
                 <w:sz w:val="17"/>
                 <w:szCs w:val="17"/>
               </w:rPr>
-              <w:t xml:space="preserve">77.26</w:t>
+              <w:t xml:space="preserve">50.78</w:t>
             </w:r>
           </w:p>
         </w:tc>
@@ -3476,7 +3476,7 @@
                 <w:sz w:val="17"/>
                 <w:szCs w:val="17"/>
               </w:rPr>
-              <w:t xml:space="preserve">—</w:t>
+              <w:t xml:space="preserve">73.96</w:t>
             </w:r>
           </w:p>
         </w:tc>
@@ -3510,7 +3510,7 @@
                 <w:sz w:val="17"/>
                 <w:szCs w:val="17"/>
               </w:rPr>
-              <w:t xml:space="preserve">LangMem †</w:t>
+              <w:t xml:space="preserve">Zep †</w:t>
             </w:r>
           </w:p>
         </w:tc>
@@ -3542,7 +3542,7 @@
                 <w:sz w:val="17"/>
                 <w:szCs w:val="17"/>
               </w:rPr>
-              <w:t xml:space="preserve">86.92</w:t>
+              <w:t xml:space="preserve">83.49</w:t>
             </w:r>
           </w:p>
         </w:tc>
@@ -3574,7 +3574,7 @@
                 <w:sz w:val="17"/>
                 <w:szCs w:val="17"/>
               </w:rPr>
-              <w:t xml:space="preserve">74.47</w:t>
+              <w:t xml:space="preserve">72.34</w:t>
             </w:r>
           </w:p>
         </w:tc>
@@ -3606,7 +3606,7 @@
                 <w:sz w:val="17"/>
                 <w:szCs w:val="17"/>
               </w:rPr>
-              <w:t xml:space="preserve">61.06</w:t>
+              <w:t xml:space="preserve">77.26</w:t>
             </w:r>
           </w:p>
         </w:tc>
@@ -3638,7 +3638,7 @@
                 <w:sz w:val="17"/>
                 <w:szCs w:val="17"/>
               </w:rPr>
-              <w:t xml:space="preserve">67.71</w:t>
+              <w:t xml:space="preserve">64.58</w:t>
             </w:r>
           </w:p>
         </w:tc>
@@ -3670,7 +3670,7 @@
                 <w:sz w:val="17"/>
                 <w:szCs w:val="17"/>
               </w:rPr>
-              <w:t xml:space="preserve">78.05</w:t>
+              <w:t xml:space="preserve">—</w:t>
             </w:r>
           </w:p>
         </w:tc>
@@ -3703,7 +3703,7 @@
                 <w:sz w:val="17"/>
                 <w:szCs w:val="17"/>
               </w:rPr>
-              <w:t xml:space="preserve">Mem0</w:t>
+              <w:t xml:space="preserve">LangMem †</w:t>
             </w:r>
           </w:p>
         </w:tc>
@@ -3734,7 +3734,7 @@
                 <w:sz w:val="17"/>
                 <w:szCs w:val="17"/>
               </w:rPr>
-              <w:t xml:space="preserve">66.47</w:t>
+              <w:t xml:space="preserve">86.92</w:t>
             </w:r>
           </w:p>
         </w:tc>
@@ -3765,7 +3765,7 @@
                 <w:sz w:val="17"/>
                 <w:szCs w:val="17"/>
               </w:rPr>
-              <w:t xml:space="preserve">62.41</w:t>
+              <w:t xml:space="preserve">74.47</w:t>
             </w:r>
           </w:p>
         </w:tc>
@@ -3796,7 +3796,7 @@
                 <w:sz w:val="17"/>
                 <w:szCs w:val="17"/>
               </w:rPr>
-              <w:t xml:space="preserve">57.32</w:t>
+              <w:t xml:space="preserve">61.06</w:t>
             </w:r>
           </w:p>
         </w:tc>
@@ -3827,7 +3827,7 @@
                 <w:sz w:val="17"/>
                 <w:szCs w:val="17"/>
               </w:rPr>
-              <w:t xml:space="preserve">44.79</w:t>
+              <w:t xml:space="preserve">67.71</w:t>
             </w:r>
           </w:p>
         </w:tc>
@@ -3858,7 +3858,7 @@
                 <w:sz w:val="17"/>
                 <w:szCs w:val="17"/>
               </w:rPr>
-              <w:t xml:space="preserve">62.47</w:t>
+              <w:t xml:space="preserve">78.05</w:t>
             </w:r>
           </w:p>
         </w:tc>
@@ -3892,7 +3892,7 @@
                 <w:sz w:val="17"/>
                 <w:szCs w:val="17"/>
               </w:rPr>
-              <w:t xml:space="preserve">MemR3 (agentic; reference)</w:t>
+              <w:t xml:space="preserve">Mem0 (literature)</w:t>
             </w:r>
           </w:p>
         </w:tc>
@@ -3924,7 +3924,7 @@
                 <w:sz w:val="17"/>
                 <w:szCs w:val="17"/>
               </w:rPr>
-              <w:t xml:space="preserve">92.17</w:t>
+              <w:t xml:space="preserve">66.47</w:t>
             </w:r>
           </w:p>
         </w:tc>
@@ -3956,7 +3956,7 @@
                 <w:sz w:val="17"/>
                 <w:szCs w:val="17"/>
               </w:rPr>
-              <w:t xml:space="preserve">81.20</w:t>
+              <w:t xml:space="preserve">62.41</w:t>
             </w:r>
           </w:p>
         </w:tc>
@@ -3988,7 +3988,7 @@
                 <w:sz w:val="17"/>
                 <w:szCs w:val="17"/>
               </w:rPr>
-              <w:t xml:space="preserve">82.14</w:t>
+              <w:t xml:space="preserve">57.32</w:t>
             </w:r>
           </w:p>
         </w:tc>
@@ -4020,7 +4020,7 @@
                 <w:sz w:val="17"/>
                 <w:szCs w:val="17"/>
               </w:rPr>
-              <w:t xml:space="preserve">71.53</w:t>
+              <w:t xml:space="preserve">44.79</w:t>
             </w:r>
           </w:p>
         </w:tc>
@@ -4052,7 +4052,7 @@
                 <w:sz w:val="17"/>
                 <w:szCs w:val="17"/>
               </w:rPr>
-              <w:t xml:space="preserve">—</w:t>
+              <w:t xml:space="preserve">62.47</w:t>
             </w:r>
           </w:p>
         </w:tc>
@@ -4085,6 +4085,195 @@
                 <w:sz w:val="17"/>
                 <w:szCs w:val="17"/>
               </w:rPr>
+              <w:t xml:space="preserve">MemR3 (agentic; reference)</w:t>
+            </w:r>
+          </w:p>
+        </w:tc>
+        <w:tc>
+          <w:tcPr>
+            <w:tcW w:type="dxa" w:w="1300"/>
+            <w:tcBorders>
+              <w:top w:val="single" w:color="BBBBBB" w:sz="1"/>
+              <w:left w:val="single" w:color="BBBBBB" w:sz="1"/>
+              <w:bottom w:val="single" w:color="BBBBBB" w:sz="1"/>
+              <w:right w:val="single" w:color="BBBBBB" w:sz="1"/>
+            </w:tcBorders>
+            <w:tcMar>
+              <w:top w:type="dxa" w:w="80"/>
+              <w:left w:type="dxa" w:w="120"/>
+              <w:bottom w:type="dxa" w:w="80"/>
+              <w:right w:type="dxa" w:w="120"/>
+            </w:tcMar>
+          </w:tcPr>
+          <w:p>
+            <w:pPr>
+              <w:jc w:val="center"/>
+            </w:pPr>
+            <w:r>
+              <w:rPr>
+                <w:b w:val="false"/>
+                <w:bCs w:val="false"/>
+                <w:sz w:val="17"/>
+                <w:szCs w:val="17"/>
+              </w:rPr>
+              <w:t xml:space="preserve">92.17</w:t>
+            </w:r>
+          </w:p>
+        </w:tc>
+        <w:tc>
+          <w:tcPr>
+            <w:tcW w:type="dxa" w:w="1300"/>
+            <w:tcBorders>
+              <w:top w:val="single" w:color="BBBBBB" w:sz="1"/>
+              <w:left w:val="single" w:color="BBBBBB" w:sz="1"/>
+              <w:bottom w:val="single" w:color="BBBBBB" w:sz="1"/>
+              <w:right w:val="single" w:color="BBBBBB" w:sz="1"/>
+            </w:tcBorders>
+            <w:tcMar>
+              <w:top w:type="dxa" w:w="80"/>
+              <w:left w:type="dxa" w:w="120"/>
+              <w:bottom w:type="dxa" w:w="80"/>
+              <w:right w:type="dxa" w:w="120"/>
+            </w:tcMar>
+          </w:tcPr>
+          <w:p>
+            <w:pPr>
+              <w:jc w:val="center"/>
+            </w:pPr>
+            <w:r>
+              <w:rPr>
+                <w:b w:val="false"/>
+                <w:bCs w:val="false"/>
+                <w:sz w:val="17"/>
+                <w:szCs w:val="17"/>
+              </w:rPr>
+              <w:t xml:space="preserve">81.20</w:t>
+            </w:r>
+          </w:p>
+        </w:tc>
+        <w:tc>
+          <w:tcPr>
+            <w:tcW w:type="dxa" w:w="1300"/>
+            <w:tcBorders>
+              <w:top w:val="single" w:color="BBBBBB" w:sz="1"/>
+              <w:left w:val="single" w:color="BBBBBB" w:sz="1"/>
+              <w:bottom w:val="single" w:color="BBBBBB" w:sz="1"/>
+              <w:right w:val="single" w:color="BBBBBB" w:sz="1"/>
+            </w:tcBorders>
+            <w:tcMar>
+              <w:top w:type="dxa" w:w="80"/>
+              <w:left w:type="dxa" w:w="120"/>
+              <w:bottom w:type="dxa" w:w="80"/>
+              <w:right w:type="dxa" w:w="120"/>
+            </w:tcMar>
+          </w:tcPr>
+          <w:p>
+            <w:pPr>
+              <w:jc w:val="center"/>
+            </w:pPr>
+            <w:r>
+              <w:rPr>
+                <w:b w:val="false"/>
+                <w:bCs w:val="false"/>
+                <w:sz w:val="17"/>
+                <w:szCs w:val="17"/>
+              </w:rPr>
+              <w:t xml:space="preserve">82.14</w:t>
+            </w:r>
+          </w:p>
+        </w:tc>
+        <w:tc>
+          <w:tcPr>
+            <w:tcW w:type="dxa" w:w="1300"/>
+            <w:tcBorders>
+              <w:top w:val="single" w:color="BBBBBB" w:sz="1"/>
+              <w:left w:val="single" w:color="BBBBBB" w:sz="1"/>
+              <w:bottom w:val="single" w:color="BBBBBB" w:sz="1"/>
+              <w:right w:val="single" w:color="BBBBBB" w:sz="1"/>
+            </w:tcBorders>
+            <w:tcMar>
+              <w:top w:type="dxa" w:w="80"/>
+              <w:left w:type="dxa" w:w="120"/>
+              <w:bottom w:type="dxa" w:w="80"/>
+              <w:right w:type="dxa" w:w="120"/>
+            </w:tcMar>
+          </w:tcPr>
+          <w:p>
+            <w:pPr>
+              <w:jc w:val="center"/>
+            </w:pPr>
+            <w:r>
+              <w:rPr>
+                <w:b w:val="false"/>
+                <w:bCs w:val="false"/>
+                <w:sz w:val="17"/>
+                <w:szCs w:val="17"/>
+              </w:rPr>
+              <w:t xml:space="preserve">71.53</w:t>
+            </w:r>
+          </w:p>
+        </w:tc>
+        <w:tc>
+          <w:tcPr>
+            <w:tcW w:type="dxa" w:w="1300"/>
+            <w:tcBorders>
+              <w:top w:val="single" w:color="BBBBBB" w:sz="1"/>
+              <w:left w:val="single" w:color="BBBBBB" w:sz="1"/>
+              <w:bottom w:val="single" w:color="BBBBBB" w:sz="1"/>
+              <w:right w:val="single" w:color="BBBBBB" w:sz="1"/>
+            </w:tcBorders>
+            <w:tcMar>
+              <w:top w:type="dxa" w:w="80"/>
+              <w:left w:type="dxa" w:w="120"/>
+              <w:bottom w:type="dxa" w:w="80"/>
+              <w:right w:type="dxa" w:w="120"/>
+            </w:tcMar>
+          </w:tcPr>
+          <w:p>
+            <w:pPr>
+              <w:jc w:val="center"/>
+            </w:pPr>
+            <w:r>
+              <w:rPr>
+                <w:b w:val="false"/>
+                <w:bCs w:val="false"/>
+                <w:sz w:val="17"/>
+                <w:szCs w:val="17"/>
+              </w:rPr>
+              <w:t xml:space="preserve">—</w:t>
+            </w:r>
+          </w:p>
+        </w:tc>
+      </w:tr>
+      <w:tr>
+        <w:tc>
+          <w:tcPr>
+            <w:tcW w:type="dxa" w:w="2860"/>
+            <w:tcBorders>
+              <w:top w:val="single" w:color="BBBBBB" w:sz="1"/>
+              <w:left w:val="single" w:color="BBBBBB" w:sz="1"/>
+              <w:bottom w:val="single" w:color="BBBBBB" w:sz="1"/>
+              <w:right w:val="single" w:color="BBBBBB" w:sz="1"/>
+            </w:tcBorders>
+            <w:shd w:fill="F2F2F2" w:val="clear"/>
+            <w:tcMar>
+              <w:top w:type="dxa" w:w="80"/>
+              <w:left w:type="dxa" w:w="120"/>
+              <w:bottom w:type="dxa" w:w="80"/>
+              <w:right w:type="dxa" w:w="120"/>
+            </w:tcMar>
+          </w:tcPr>
+          <w:p>
+            <w:pPr>
+              <w:jc w:val="left"/>
+            </w:pPr>
+            <w:r>
+              <w:rPr>
+                <w:b w:val="false"/>
+                <w:bCs w:val="false"/>
+                <w:sz w:val="17"/>
+                <w:szCs w:val="17"/>
+              </w:rPr>
               <w:t xml:space="preserve">Full-context ceiling</w:t>
             </w:r>
           </w:p>
@@ -4098,6 +4287,7 @@
               <w:bottom w:val="single" w:color="BBBBBB" w:sz="1"/>
               <w:right w:val="single" w:color="BBBBBB" w:sz="1"/>
             </w:tcBorders>
+            <w:shd w:fill="F2F2F2" w:val="clear"/>
             <w:tcMar>
               <w:top w:type="dxa" w:w="80"/>
               <w:left w:type="dxa" w:w="120"/>
@@ -4129,6 +4319,7 @@
               <w:bottom w:val="single" w:color="BBBBBB" w:sz="1"/>
               <w:right w:val="single" w:color="BBBBBB" w:sz="1"/>
             </w:tcBorders>
+            <w:shd w:fill="F2F2F2" w:val="clear"/>
             <w:tcMar>
               <w:top w:type="dxa" w:w="80"/>
               <w:left w:type="dxa" w:w="120"/>
@@ -4160,6 +4351,7 @@
               <w:bottom w:val="single" w:color="BBBBBB" w:sz="1"/>
               <w:right w:val="single" w:color="BBBBBB" w:sz="1"/>
             </w:tcBorders>
+            <w:shd w:fill="F2F2F2" w:val="clear"/>
             <w:tcMar>
               <w:top w:type="dxa" w:w="80"/>
               <w:left w:type="dxa" w:w="120"/>
@@ -4191,6 +4383,7 @@
               <w:bottom w:val="single" w:color="BBBBBB" w:sz="1"/>
               <w:right w:val="single" w:color="BBBBBB" w:sz="1"/>
             </w:tcBorders>
+            <w:shd w:fill="F2F2F2" w:val="clear"/>
             <w:tcMar>
               <w:top w:type="dxa" w:w="80"/>
               <w:left w:type="dxa" w:w="120"/>
@@ -4222,6 +4415,7 @@
               <w:bottom w:val="single" w:color="BBBBBB" w:sz="1"/>
               <w:right w:val="single" w:color="BBBBBB" w:sz="1"/>
             </w:tcBorders>
+            <w:shd w:fill="F2F2F2" w:val="clear"/>
             <w:tcMar>
               <w:top w:type="dxa" w:w="80"/>
               <w:left w:type="dxa" w:w="120"/>
@@ -4258,7 +4452,7 @@
           <w:sz w:val="17"/>
           <w:szCs w:val="17"/>
         </w:rPr>
-        <w:t xml:space="preserve">Table 2: Corrected LoCoMo landscape (GPT-4.1-mini protocol, %). † Cross-sourced from Du et al., not re-run in our harness; only the Memori row is same-harness with ours. MemR3 is an agentic retrieval pipeline, not a memory substrate; shown for reference.</w:t>
+        <w:t xml:space="preserve">Table 2: Corrected LoCoMo landscape (GPT-4.1-mini protocol, %). ‡ Mem0 re-run by us on the same answerer + same judge (substrate-vs-substrate): we lead every category, temporal by +32.7pp — its higher overall vs. the literature row reflects our stronger shared answerer over Mem0’s retrieval. † Zep/LangMem cross-sourced from Du et al., not re-run (Zep is hosted-cloud; the LangMem package is a different generation than its LoCoMo baseline). MemR3 is an agentic pipeline, not a memory substrate; shown for reference.</w:t>
       </w:r>
     </w:p>
     <w:p>
@@ -4266,7 +4460,7 @@
         <w:spacing w:after="140"/>
       </w:pPr>
       <w:r>
-        <w:t xml:space="preserve">Against the corrected field, Hive Mind leads every category among memory systems, exceeds the agentic MemR3 pipeline on single-hop and multi-hop, and sits at the full-context ceiling on open-domain. The headline statistical claim remains the same-judge comparison: 87.66 vs. 81.95, +5.71pp, z=4.42, p&lt;10⁻⁵. Our result also exceeds Hindsight’s 85.67%, reported with a local answering model under a related protocol.</w:t>
+        <w:t xml:space="preserve">Against the corrected field, Hive Mind leads every category among memory systems, exceeds the agentic MemR3 pipeline on single-hop and multi-hop, and sits at the full-context ceiling on open-domain. Two of the comparisons are now same-judge head-to-heads — Memori (their pipeline reproduced at 81.98 vs. published 81.95) and Mem0 (re-run by us; 73.96, led in every category) — so the result no longer rests on cross-paper numbers alone. The headline statistical claim remains the same-judge Memori comparison: 87.66 vs. 81.95, +5.71pp, z=4.42, p&lt;10⁻⁵. Our result also exceeds Hindsight’s 85.67%, reported with a local answering model under a related protocol.</w:t>
       </w:r>
     </w:p>
     <w:p>
@@ -4295,7 +4489,7 @@
         <w:t xml:space="preserve">Token cost. </w:t>
       </w:r>
       <w:r>
-        <w:t xml:space="preserve">3,747 tokens/question vs. Memori’s 1,294 (≈2.9×). Memori’s thesis — strong reasoning at low cost — still wins the efficiency axis. The heavy lanes are by construction the semantic snippets (full frame bodies) and the raw-detail excerpts; per-lane token budgeting is the planned next step, targeting ≤1,500/q at iso-accuracy.</w:t>
+        <w:t xml:space="preserve">3,747 tokens/question vs. Memori’s 1,294 (≈2.9×). We measured the packing trade: per-lane caps cut context 28% (→2,694 tok) for −2.3pp (85.32%, still ahead of every memory system), but matching Memori’s exact budget (≤1,500 tok) costs ~11pp — the retrieval lanes are load-bearing (consistent with the W3.4 ablation: the raw-detail lane drives single-hop). There is no free ≤1,500-token operating point; Memori retains the efficiency axis.</w:t>
       </w:r>
     </w:p>
     <w:p>
@@ -4335,7 +4529,7 @@
         <w:t xml:space="preserve">Cross-sourced baselines. </w:t>
       </w:r>
       <w:r>
-        <w:t xml:space="preserve">Zep/LangMem/Mem0 rows are not same-harness; only the Memori comparison carries the statistical claim. Re-running the major baselines in our harness is planned.</w:t>
+        <w:t xml:space="preserve">Memori and Mem0 are now same-harness, same-judge; Zep and LangMem remain cross-sourced (Zep is hosted-cloud without a self-host path; the current LangMem package is a different generation than its LoCoMo baseline, so a re-run would not be comparable). The statistical claims rest on the two same-judge rows.</w:t>
       </w:r>
     </w:p>
     <w:p>
@@ -4412,7 +4606,7 @@
         <w:spacing w:after="140"/>
       </w:pPr>
       <w:r>
-        <w:t xml:space="preserve">A layered, fully local memory substrate — profiles for synthesis, write-time-dated episodic timelines for temporal anchoring, hybrid retrieval with reranking for relevance, and a verbatim raw-detail escalation lane for fine-grained recall — achieves 87.66% on LoCoMo under the strictest comparison standard available: the prior SOTA system’s own protocol, reproduced and re-judged in-harness. The category structure of the result supports the central design thesis: no single memory representation wins long-term conversational memory; a substrate that layers several, each rendered in its place, does. All code, including the benchmark harness and per-question artifacts, is open source at github.com/marolinik/hive-mind.</w:t>
+        <w:t xml:space="preserve">A layered, fully local memory substrate — profiles for synthesis, write-time-dated episodic timelines for temporal anchoring, hybrid retrieval with reranking for relevance, and a verbatim raw-detail escalation lane for fine-grained recall — achieves 87.66% on LoCoMo under the strictest comparison standard available: the prior SOTA system’s own protocol, reproduced and re-judged in-harness. The category structure of the result supports the central design thesis: no single memory representation wins long-term conversational memory; a substrate that layers several, each rendered in its place, does. All code, including the benchmark harness and per-question artifacts, is open source at github.com/marolinik/hive-mind — the full winning-stack parity port is merged to master (CI green, 654/654 tests), so the public repository reproduces the configuration reported here.</w:t>
       </w:r>
     </w:p>
     <w:p>

</xml_diff>

<commit_message>
docs(paper): regenerate .docx at corrected 86.49% headline
Regenerated the readable paper + team briefing .docx from the (corrected)
.scratch/docx-build generators: 87.66% -> 86.49% (7-lane W4, +4.54pp, z=4.64),
per-category tables, Mem0 (+12.5/+30.8), single-hop 92.75->92.27. Draft note
carries the correction (the sole remaining 87.66 mention). Token-Pareto + per-step
ladder stats left under the correction note pending re-verification.
</commit_message>
<xml_diff>
--- a/docs/paper/2026-06-12-locomo-sota-paper-draft.docx
+++ b/docs/paper/2026-06-12-locomo-sota-paper-draft.docx
@@ -43,7 +43,7 @@
           <w:sz w:val="18"/>
           <w:szCs w:val="18"/>
         </w:rPr>
-        <w:t xml:space="preserve">June 2026 — DRAFT v0.2 (readable .docx; Mem0 same-judge + token Pareto folded in; not yet submitted)</w:t>
+        <w:t xml:space="preserve">June 2026 — DRAFT v0.3 — CORRECTION: headline is 86.49% (7-lane W4, +4.54pp, z=4.64); the earlier 87.66% did not reproduce (stale-verdict-replay inflation). Per-step ladder + token figures being re-verified. Not yet submitted</w:t>
       </w:r>
     </w:p>
     <w:p>
@@ -67,10 +67,10 @@
           <w:b/>
           <w:bCs/>
         </w:rPr>
-        <w:t xml:space="preserve">87.66% overall — +5.71pp above the best previously published memory system (Memori, 81.95%; one-sample z=4.42, p&lt;10⁻⁵)</w:t>
-      </w:r>
-      <w:r>
-        <w:t xml:space="preserve"> — and leads or ties every question category among memory systems, with open-domain accuracy statistically indistinguishable from the full-context ceiling. We reproduce Memori’s own pipeline to within 0.03pp before comparing, making this a same-judge, same-protocol comparison rather than a cross-paper one. We report the full intervention ladder, including pre-registered, significance-tested gates for each step, three negative results we believe are independently useful (session-date-stamped episodic memories are systematically wrong; relevance-ranked episodic injection neutralizes its own benefit; answer-prompt date arithmetic cannot substitute for write-time date resolution), and an ablation that attributes the final gain to the interaction of input parity (image captions) with a raw-detail escalation lane. We also document a column-scrambling error in the baseline table of the Memori paper that has propagated through recent literature, and re-derive the corrected field; and we re-run Mem0 under our own judge, where we lead every category (overall +13.7pp, temporal +32.7pp). The substrate, including the benchmark harness, is open source. On token cost (3,747 vs. Memori’s 1,294), context packing yields a 28% reduction at near-iso accuracy (85.3%), but matching the prior budget exactly costs ~11pp — the retrieval lanes are load-bearing.</w:t>
+        <w:t xml:space="preserve">86.49% overall — +4.54pp above the best previously published memory system (Memori, 81.95%; one-sample z=4.64, p&lt;10⁻⁵)</w:t>
+      </w:r>
+      <w:r>
+        <w:t xml:space="preserve"> — and leads or ties every question category among memory systems, with open-domain accuracy statistically indistinguishable from the full-context ceiling. We reproduce Memori’s own pipeline to within 0.03pp before comparing, making this a same-judge, same-protocol comparison rather than a cross-paper one. We report the full intervention ladder, including pre-registered, significance-tested gates for each step, three negative results we believe are independently useful (session-date-stamped episodic memories are systematically wrong; relevance-ranked episodic injection neutralizes its own benefit; answer-prompt date arithmetic cannot substitute for write-time date resolution), and an ablation that attributes the final gain to the interaction of input parity (image captions) with a raw-detail escalation lane. We also document a column-scrambling error in the baseline table of the Memori paper that has propagated through recent literature, and re-derive the corrected field; and we re-run Mem0 under our own judge, where we lead every category (overall +12.5pp, temporal +30.8pp). The substrate, including the benchmark harness, is open source. On token cost (3,747 vs. Memori’s 1,294), context packing yields a 28% reduction at near-iso accuracy (85.3%), but matching the prior budget exactly costs ~11pp — the retrieval lanes are load-bearing.</w:t>
       </w:r>
     </w:p>
     <w:p>
@@ -115,7 +115,7 @@
         <w:t xml:space="preserve">A SOTA result under a reproduced protocol. </w:t>
       </w:r>
       <w:r>
-        <w:t xml:space="preserve">87.66% overall on LoCoMo under Memori’s own published protocol and judge, +5.71pp over Memori’s 81.95% (z=4.42, p&lt;10⁻⁵), leading every category among memory systems. Before comparing, we reproduced Memori’s released pipeline to 81.98% vs. their published 81.95% — the comparison is same-judge and same-protocol, not cross-paper.</w:t>
+        <w:t xml:space="preserve">86.49% overall on LoCoMo under Memori’s own published protocol and judge, +4.54pp over Memori’s 81.95% (z=4.64, p&lt;10⁻⁵), leading every category among memory systems. Before comparing, we reproduced Memori’s released pipeline to 81.98% vs. their published 81.95% — the comparison is same-judge and same-protocol, not cross-paper.</w:t>
       </w:r>
     </w:p>
     <w:p>
@@ -1793,7 +1793,7 @@
                 <w:sz w:val="17"/>
                 <w:szCs w:val="17"/>
               </w:rPr>
-              <w:t xml:space="preserve">70.83</w:t>
+              <w:t xml:space="preserve">69.79</w:t>
             </w:r>
           </w:p>
         </w:tc>
@@ -2142,7 +2142,7 @@
                 <w:sz w:val="17"/>
                 <w:szCs w:val="17"/>
               </w:rPr>
-              <w:t xml:space="preserve">92.75</w:t>
+              <w:t xml:space="preserve">92.27</w:t>
             </w:r>
           </w:p>
         </w:tc>
@@ -2174,7 +2174,7 @@
                 <w:sz w:val="17"/>
                 <w:szCs w:val="17"/>
               </w:rPr>
-              <w:t xml:space="preserve">82.98</w:t>
+              <w:t xml:space="preserve">80.50</w:t>
             </w:r>
           </w:p>
         </w:tc>
@@ -2206,7 +2206,7 @@
                 <w:sz w:val="17"/>
                 <w:szCs w:val="17"/>
               </w:rPr>
-              <w:t xml:space="preserve">83.49</w:t>
+              <w:t xml:space="preserve">81.62</w:t>
             </w:r>
           </w:p>
         </w:tc>
@@ -2238,7 +2238,7 @@
                 <w:sz w:val="17"/>
                 <w:szCs w:val="17"/>
               </w:rPr>
-              <w:t xml:space="preserve">70.83</w:t>
+              <w:t xml:space="preserve">69.79</w:t>
             </w:r>
           </w:p>
         </w:tc>
@@ -2270,7 +2270,7 @@
                 <w:sz w:val="17"/>
                 <w:szCs w:val="17"/>
               </w:rPr>
-              <w:t xml:space="preserve">87.66</w:t>
+              <w:t xml:space="preserve">86.49</w:t>
             </w:r>
           </w:p>
         </w:tc>
@@ -2624,7 +2624,7 @@
         <w:spacing w:after="140"/>
       </w:pPr>
       <w:r>
-        <w:t xml:space="preserve">Answer-policy fixes (W1) recovered the measured “prompt tax” — notably 16 of 34 open-domain failures were guaranteed-zero abstentions on speculative questions — lifting open-domain +7.3pp and crossing the first significance milestone vs. Memori (84.48%, z=2.58, p&lt;0.01). Per-speaker profile cards (W2a) added the open-domain synthesis layer (70.83%, statistically at the full-context ceiling of 71.88%, z=−0.23) after a bundled W2 attempt failed its gate and was decomposed — the bundled episodic-v2 rewrite had over-coarsened date labels and was reverted. The deterministic date-window lane (W3.1) reached 85.00% overall (z=3.11 vs. Memori). An enumeration-instruction variant (W3.2) was a wash and was reverted — we kept the configuration evidence-minimal.</w:t>
+        <w:t xml:space="preserve">Answer-policy fixes (W1) recovered the measured “prompt tax” — notably 16 of 34 open-domain failures were guaranteed-zero abstentions on speculative questions — lifting open-domain +7.3pp and crossing the first significance milestone vs. Memori (84.48%, z=2.58, p&lt;0.01). Per-speaker profile cards (W2a) added the open-domain synthesis layer (69.79%, statistically at the full-context ceiling of 71.88%, z=−0.23) after a bundled W2 attempt failed its gate and was decomposed — the bundled episodic-v2 rewrite had over-coarsened date labels and was reverted. The deterministic date-window lane (W3.1) reached 85.00% overall (z=3.11 vs. Memori). An enumeration-instruction variant (W3.2) was a wash and was reverted — we kept the configuration evidence-minimal.</w:t>
       </w:r>
     </w:p>
     <w:p>
@@ -2653,7 +2653,7 @@
           <w:b/>
           <w:bCs/>
         </w:rPr>
-        <w:t xml:space="preserve">Result: single-hop 92.75% (+4.52, z=3.16, p&lt;0.002; within 1pp of the 93.73% full-context ceiling), overall 87.66% (+2.66 over W3.1, z=2.15, p&lt;0.05).</w:t>
+        <w:t xml:space="preserve">Result: single-hop 92.27% (+4.52, z=3.16, p&lt;0.002; within 1pp of the 93.73% full-context ceiling), overall 86.49% (+2.66 over W3.1, z=2.15, p&lt;0.05).</w:t>
       </w:r>
     </w:p>
     <w:p>
@@ -2970,7 +2970,7 @@
                 <w:sz w:val="17"/>
                 <w:szCs w:val="17"/>
               </w:rPr>
-              <w:t xml:space="preserve">92.75</w:t>
+              <w:t xml:space="preserve">92.27</w:t>
             </w:r>
           </w:p>
         </w:tc>
@@ -3001,7 +3001,7 @@
                 <w:sz w:val="17"/>
                 <w:szCs w:val="17"/>
               </w:rPr>
-              <w:t xml:space="preserve">82.98</w:t>
+              <w:t xml:space="preserve">80.50</w:t>
             </w:r>
           </w:p>
         </w:tc>
@@ -3032,7 +3032,7 @@
                 <w:sz w:val="17"/>
                 <w:szCs w:val="17"/>
               </w:rPr>
-              <w:t xml:space="preserve">83.49</w:t>
+              <w:t xml:space="preserve">81.62</w:t>
             </w:r>
           </w:p>
         </w:tc>
@@ -3063,7 +3063,7 @@
                 <w:sz w:val="17"/>
                 <w:szCs w:val="17"/>
               </w:rPr>
-              <w:t xml:space="preserve">70.83</w:t>
+              <w:t xml:space="preserve">69.79</w:t>
             </w:r>
           </w:p>
         </w:tc>
@@ -3094,7 +3094,7 @@
                 <w:sz w:val="17"/>
                 <w:szCs w:val="17"/>
               </w:rPr>
-              <w:t xml:space="preserve">87.66</w:t>
+              <w:t xml:space="preserve">86.49</w:t>
             </w:r>
           </w:p>
         </w:tc>
@@ -4452,7 +4452,7 @@
           <w:sz w:val="17"/>
           <w:szCs w:val="17"/>
         </w:rPr>
-        <w:t xml:space="preserve">Table 2: Corrected LoCoMo landscape (GPT-4.1-mini protocol, %). ‡ Mem0 re-run by us on the same answerer + same judge (substrate-vs-substrate): we lead every category, temporal by +32.7pp — its higher overall vs. the literature row reflects our stronger shared answerer over Mem0’s retrieval. † Zep/LangMem cross-sourced from Du et al., not re-run (Zep is hosted-cloud; the LangMem package is a different generation than its LoCoMo baseline). MemR3 is an agentic pipeline, not a memory substrate; shown for reference.</w:t>
+        <w:t xml:space="preserve">Table 2: Corrected LoCoMo landscape (GPT-4.1-mini protocol, %). ‡ Mem0 re-run by us on the same answerer + same judge (substrate-vs-substrate): we lead every category, temporal by +30.8pp — its higher overall vs. the literature row reflects our stronger shared answerer over Mem0’s retrieval. † Zep/LangMem cross-sourced from Du et al., not re-run (Zep is hosted-cloud; the LangMem package is a different generation than its LoCoMo baseline). MemR3 is an agentic pipeline, not a memory substrate; shown for reference.</w:t>
       </w:r>
     </w:p>
     <w:p>
@@ -4460,7 +4460,7 @@
         <w:spacing w:after="140"/>
       </w:pPr>
       <w:r>
-        <w:t xml:space="preserve">Against the corrected field, Hive Mind leads every category among memory systems, exceeds the agentic MemR3 pipeline on single-hop and multi-hop, and sits at the full-context ceiling on open-domain. Two of the comparisons are now same-judge head-to-heads — Memori (their pipeline reproduced at 81.98 vs. published 81.95) and Mem0 (re-run by us; 73.96, led in every category) — so the result no longer rests on cross-paper numbers alone. The headline statistical claim remains the same-judge Memori comparison: 87.66 vs. 81.95, +5.71pp, z=4.42, p&lt;10⁻⁵. Our result also exceeds Hindsight’s 85.67%, reported with a local answering model under a related protocol.</w:t>
+        <w:t xml:space="preserve">Against the corrected field, Hive Mind leads every category among memory systems, exceeds the agentic MemR3 pipeline on single-hop and multi-hop, and sits at the full-context ceiling on open-domain. Two of the comparisons are now same-judge head-to-heads — Memori (their pipeline reproduced at 81.98 vs. published 81.95) and Mem0 (re-run by us; 73.96, led in every category) — so the result no longer rests on cross-paper numbers alone. The headline statistical claim remains the same-judge Memori comparison: 86.49 vs. 81.95, +4.54pp, z=4.64, p&lt;10⁻⁵. Our result also exceeds Hindsight’s 85.67%, reported with a local answering model under a related protocol.</w:t>
       </w:r>
     </w:p>
     <w:p>
@@ -4606,7 +4606,7 @@
         <w:spacing w:after="140"/>
       </w:pPr>
       <w:r>
-        <w:t xml:space="preserve">A layered, fully local memory substrate — profiles for synthesis, write-time-dated episodic timelines for temporal anchoring, hybrid retrieval with reranking for relevance, and a verbatim raw-detail escalation lane for fine-grained recall — achieves 87.66% on LoCoMo under the strictest comparison standard available: the prior SOTA system’s own protocol, reproduced and re-judged in-harness. The category structure of the result supports the central design thesis: no single memory representation wins long-term conversational memory; a substrate that layers several, each rendered in its place, does. All code, including the benchmark harness and per-question artifacts, is open source at github.com/marolinik/hive-mind — the full winning-stack parity port is merged to master (CI green, 654/654 tests), so the public repository reproduces the configuration reported here.</w:t>
+        <w:t xml:space="preserve">A layered, fully local memory substrate — profiles for synthesis, write-time-dated episodic timelines for temporal anchoring, hybrid retrieval with reranking for relevance, and a verbatim raw-detail escalation lane for fine-grained recall — achieves 86.49% on LoCoMo under the strictest comparison standard available: the prior SOTA system’s own protocol, reproduced and re-judged in-harness. The category structure of the result supports the central design thesis: no single memory representation wins long-term conversational memory; a substrate that layers several, each rendered in its place, does. All code, including the benchmark harness and per-question artifacts, is open source at github.com/marolinik/hive-mind — the full winning-stack parity port is merged to master (CI green, 654/654 tests), so the public repository reproduces the configuration reported here.</w:t>
       </w:r>
     </w:p>
     <w:p>

</xml_diff>

<commit_message>
docs(paper): correct LoCoMo headline 87.66 -> 86.49 in paper draft + team briefing docx
2026-07-01 integrity correction: 87.66 did not reproduce on fresh judge pass
(stale-verdict-replay inflation). 86.49 is the fresh reproducible number.
See docs/analysis/locomo-87.66-vs-85.26-integrity-2026-06-30.md.
</commit_message>
<xml_diff>
--- a/docs/paper/2026-06-12-locomo-sota-paper-draft.docx
+++ b/docs/paper/2026-06-12-locomo-sota-paper-draft.docx
@@ -43,7 +43,7 @@
           <w:sz w:val="18"/>
           <w:szCs w:val="18"/>
         </w:rPr>
-        <w:t xml:space="preserve">June 2026 — DRAFT v0.2 (readable .docx; Mem0 same-judge + token Pareto folded in; not yet submitted)</w:t>
+        <w:t xml:space="preserve">June 2026 — DRAFT v0.3 — CORRECTION: headline is 86.49% (7-lane W4, +4.54pp, z=4.64); the earlier 87.66% did not reproduce (stale-verdict-replay inflation). Per-step ladder + token figures being re-verified. Not yet submitted</w:t>
       </w:r>
     </w:p>
     <w:p>
@@ -67,10 +67,10 @@
           <w:b/>
           <w:bCs/>
         </w:rPr>
-        <w:t xml:space="preserve">87.66% overall — +5.71pp above the best previously published memory system (Memori, 81.95%; one-sample z=4.42, p&lt;10⁻⁵)</w:t>
-      </w:r>
-      <w:r>
-        <w:t xml:space="preserve"> — and leads or ties every question category among memory systems, with open-domain accuracy statistically indistinguishable from the full-context ceiling. We reproduce Memori’s own pipeline to within 0.03pp before comparing, making this a same-judge, same-protocol comparison rather than a cross-paper one. We report the full intervention ladder, including pre-registered, significance-tested gates for each step, three negative results we believe are independently useful (session-date-stamped episodic memories are systematically wrong; relevance-ranked episodic injection neutralizes its own benefit; answer-prompt date arithmetic cannot substitute for write-time date resolution), and an ablation that attributes the final gain to the interaction of input parity (image captions) with a raw-detail escalation lane. We also document a column-scrambling error in the baseline table of the Memori paper that has propagated through recent literature, and re-derive the corrected field; and we re-run Mem0 under our own judge, where we lead every category (overall +13.7pp, temporal +32.7pp). The substrate, including the benchmark harness, is open source. On token cost (3,747 vs. Memori’s 1,294), context packing yields a 28% reduction at near-iso accuracy (85.3%), but matching the prior budget exactly costs ~11pp — the retrieval lanes are load-bearing.</w:t>
+        <w:t xml:space="preserve">86.49% overall — +4.54pp above the best previously published memory system (Memori, 81.95%; one-sample z=4.64, p&lt;10⁻⁵)</w:t>
+      </w:r>
+      <w:r>
+        <w:t xml:space="preserve"> — and leads or ties every question category among memory systems, with open-domain accuracy statistically indistinguishable from the full-context ceiling. We reproduce Memori’s own pipeline to within 0.03pp before comparing, making this a same-judge, same-protocol comparison rather than a cross-paper one. We report the full intervention ladder, including pre-registered, significance-tested gates for each step, three negative results we believe are independently useful (session-date-stamped episodic memories are systematically wrong; relevance-ranked episodic injection neutralizes its own benefit; answer-prompt date arithmetic cannot substitute for write-time date resolution), and an ablation that attributes the final gain to the interaction of input parity (image captions) with a raw-detail escalation lane. We also document a column-scrambling error in the baseline table of the Memori paper that has propagated through recent literature, and re-derive the corrected field; and we re-run Mem0 under our own judge, where we lead every category (overall +12.5pp, temporal +30.8pp). The substrate, including the benchmark harness, is open source. On token cost (3,747 vs. Memori’s 1,294), context packing yields a 28% reduction at near-iso accuracy (85.3%), but matching the prior budget exactly costs ~11pp — the retrieval lanes are load-bearing.</w:t>
       </w:r>
     </w:p>
     <w:p>
@@ -115,7 +115,7 @@
         <w:t xml:space="preserve">A SOTA result under a reproduced protocol. </w:t>
       </w:r>
       <w:r>
-        <w:t xml:space="preserve">87.66% overall on LoCoMo under Memori’s own published protocol and judge, +5.71pp over Memori’s 81.95% (z=4.42, p&lt;10⁻⁵), leading every category among memory systems. Before comparing, we reproduced Memori’s released pipeline to 81.98% vs. their published 81.95% — the comparison is same-judge and same-protocol, not cross-paper.</w:t>
+        <w:t xml:space="preserve">86.49% overall on LoCoMo under Memori’s own published protocol and judge, +4.54pp over Memori’s 81.95% (z=4.64, p&lt;10⁻⁵), leading every category among memory systems. Before comparing, we reproduced Memori’s released pipeline to 81.98% vs. their published 81.95% — the comparison is same-judge and same-protocol, not cross-paper.</w:t>
       </w:r>
     </w:p>
     <w:p>
@@ -1793,7 +1793,7 @@
                 <w:sz w:val="17"/>
                 <w:szCs w:val="17"/>
               </w:rPr>
-              <w:t xml:space="preserve">70.83</w:t>
+              <w:t xml:space="preserve">69.79</w:t>
             </w:r>
           </w:p>
         </w:tc>
@@ -2142,7 +2142,7 @@
                 <w:sz w:val="17"/>
                 <w:szCs w:val="17"/>
               </w:rPr>
-              <w:t xml:space="preserve">92.75</w:t>
+              <w:t xml:space="preserve">92.27</w:t>
             </w:r>
           </w:p>
         </w:tc>
@@ -2174,7 +2174,7 @@
                 <w:sz w:val="17"/>
                 <w:szCs w:val="17"/>
               </w:rPr>
-              <w:t xml:space="preserve">82.98</w:t>
+              <w:t xml:space="preserve">80.50</w:t>
             </w:r>
           </w:p>
         </w:tc>
@@ -2206,7 +2206,7 @@
                 <w:sz w:val="17"/>
                 <w:szCs w:val="17"/>
               </w:rPr>
-              <w:t xml:space="preserve">83.49</w:t>
+              <w:t xml:space="preserve">81.62</w:t>
             </w:r>
           </w:p>
         </w:tc>
@@ -2238,7 +2238,7 @@
                 <w:sz w:val="17"/>
                 <w:szCs w:val="17"/>
               </w:rPr>
-              <w:t xml:space="preserve">70.83</w:t>
+              <w:t xml:space="preserve">69.79</w:t>
             </w:r>
           </w:p>
         </w:tc>
@@ -2270,7 +2270,7 @@
                 <w:sz w:val="17"/>
                 <w:szCs w:val="17"/>
               </w:rPr>
-              <w:t xml:space="preserve">87.66</w:t>
+              <w:t xml:space="preserve">86.49</w:t>
             </w:r>
           </w:p>
         </w:tc>
@@ -2624,7 +2624,7 @@
         <w:spacing w:after="140"/>
       </w:pPr>
       <w:r>
-        <w:t xml:space="preserve">Answer-policy fixes (W1) recovered the measured “prompt tax” — notably 16 of 34 open-domain failures were guaranteed-zero abstentions on speculative questions — lifting open-domain +7.3pp and crossing the first significance milestone vs. Memori (84.48%, z=2.58, p&lt;0.01). Per-speaker profile cards (W2a) added the open-domain synthesis layer (70.83%, statistically at the full-context ceiling of 71.88%, z=−0.23) after a bundled W2 attempt failed its gate and was decomposed — the bundled episodic-v2 rewrite had over-coarsened date labels and was reverted. The deterministic date-window lane (W3.1) reached 85.00% overall (z=3.11 vs. Memori). An enumeration-instruction variant (W3.2) was a wash and was reverted — we kept the configuration evidence-minimal.</w:t>
+        <w:t xml:space="preserve">Answer-policy fixes (W1) recovered the measured “prompt tax” — notably 16 of 34 open-domain failures were guaranteed-zero abstentions on speculative questions — lifting open-domain +7.3pp and crossing the first significance milestone vs. Memori (84.48%, z=2.58, p&lt;0.01). Per-speaker profile cards (W2a) added the open-domain synthesis layer (69.79%, statistically at the full-context ceiling of 71.88%, z=−0.23) after a bundled W2 attempt failed its gate and was decomposed — the bundled episodic-v2 rewrite had over-coarsened date labels and was reverted. The deterministic date-window lane (W3.1) reached 85.00% overall (z=3.11 vs. Memori). An enumeration-instruction variant (W3.2) was a wash and was reverted — we kept the configuration evidence-minimal.</w:t>
       </w:r>
     </w:p>
     <w:p>
@@ -2653,7 +2653,7 @@
           <w:b/>
           <w:bCs/>
         </w:rPr>
-        <w:t xml:space="preserve">Result: single-hop 92.75% (+4.52, z=3.16, p&lt;0.002; within 1pp of the 93.73% full-context ceiling), overall 87.66% (+2.66 over W3.1, z=2.15, p&lt;0.05).</w:t>
+        <w:t xml:space="preserve">Result: single-hop 92.27% (+4.52, z=3.16, p&lt;0.002; within 1pp of the 93.73% full-context ceiling), overall 86.49% (+2.66 over W3.1, z=2.15, p&lt;0.05).</w:t>
       </w:r>
     </w:p>
     <w:p>
@@ -2970,7 +2970,7 @@
                 <w:sz w:val="17"/>
                 <w:szCs w:val="17"/>
               </w:rPr>
-              <w:t xml:space="preserve">92.75</w:t>
+              <w:t xml:space="preserve">92.27</w:t>
             </w:r>
           </w:p>
         </w:tc>
@@ -3001,7 +3001,7 @@
                 <w:sz w:val="17"/>
                 <w:szCs w:val="17"/>
               </w:rPr>
-              <w:t xml:space="preserve">82.98</w:t>
+              <w:t xml:space="preserve">80.50</w:t>
             </w:r>
           </w:p>
         </w:tc>
@@ -3032,7 +3032,7 @@
                 <w:sz w:val="17"/>
                 <w:szCs w:val="17"/>
               </w:rPr>
-              <w:t xml:space="preserve">83.49</w:t>
+              <w:t xml:space="preserve">81.62</w:t>
             </w:r>
           </w:p>
         </w:tc>
@@ -3063,7 +3063,7 @@
                 <w:sz w:val="17"/>
                 <w:szCs w:val="17"/>
               </w:rPr>
-              <w:t xml:space="preserve">70.83</w:t>
+              <w:t xml:space="preserve">69.79</w:t>
             </w:r>
           </w:p>
         </w:tc>
@@ -3094,7 +3094,7 @@
                 <w:sz w:val="17"/>
                 <w:szCs w:val="17"/>
               </w:rPr>
-              <w:t xml:space="preserve">87.66</w:t>
+              <w:t xml:space="preserve">86.49</w:t>
             </w:r>
           </w:p>
         </w:tc>
@@ -4452,7 +4452,7 @@
           <w:sz w:val="17"/>
           <w:szCs w:val="17"/>
         </w:rPr>
-        <w:t xml:space="preserve">Table 2: Corrected LoCoMo landscape (GPT-4.1-mini protocol, %). ‡ Mem0 re-run by us on the same answerer + same judge (substrate-vs-substrate): we lead every category, temporal by +32.7pp — its higher overall vs. the literature row reflects our stronger shared answerer over Mem0’s retrieval. † Zep/LangMem cross-sourced from Du et al., not re-run (Zep is hosted-cloud; the LangMem package is a different generation than its LoCoMo baseline). MemR3 is an agentic pipeline, not a memory substrate; shown for reference.</w:t>
+        <w:t xml:space="preserve">Table 2: Corrected LoCoMo landscape (GPT-4.1-mini protocol, %). ‡ Mem0 re-run by us on the same answerer + same judge (substrate-vs-substrate): we lead every category, temporal by +30.8pp — its higher overall vs. the literature row reflects our stronger shared answerer over Mem0’s retrieval. † Zep/LangMem cross-sourced from Du et al., not re-run (Zep is hosted-cloud; the LangMem package is a different generation than its LoCoMo baseline). MemR3 is an agentic pipeline, not a memory substrate; shown for reference.</w:t>
       </w:r>
     </w:p>
     <w:p>
@@ -4460,7 +4460,7 @@
         <w:spacing w:after="140"/>
       </w:pPr>
       <w:r>
-        <w:t xml:space="preserve">Against the corrected field, Hive Mind leads every category among memory systems, exceeds the agentic MemR3 pipeline on single-hop and multi-hop, and sits at the full-context ceiling on open-domain. Two of the comparisons are now same-judge head-to-heads — Memori (their pipeline reproduced at 81.98 vs. published 81.95) and Mem0 (re-run by us; 73.96, led in every category) — so the result no longer rests on cross-paper numbers alone. The headline statistical claim remains the same-judge Memori comparison: 87.66 vs. 81.95, +5.71pp, z=4.42, p&lt;10⁻⁵. Our result also exceeds Hindsight’s 85.67%, reported with a local answering model under a related protocol.</w:t>
+        <w:t xml:space="preserve">Against the corrected field, Hive Mind leads every category among memory systems, exceeds the agentic MemR3 pipeline on single-hop and multi-hop, and sits at the full-context ceiling on open-domain. Two of the comparisons are now same-judge head-to-heads — Memori (their pipeline reproduced at 81.98 vs. published 81.95) and Mem0 (re-run by us; 73.96, led in every category) — so the result no longer rests on cross-paper numbers alone. The headline statistical claim remains the same-judge Memori comparison: 86.49 vs. 81.95, +4.54pp, z=4.64, p&lt;10⁻⁵. Our result also exceeds Hindsight’s 85.67%, reported with a local answering model under a related protocol.</w:t>
       </w:r>
     </w:p>
     <w:p>
@@ -4606,7 +4606,7 @@
         <w:spacing w:after="140"/>
       </w:pPr>
       <w:r>
-        <w:t xml:space="preserve">A layered, fully local memory substrate — profiles for synthesis, write-time-dated episodic timelines for temporal anchoring, hybrid retrieval with reranking for relevance, and a verbatim raw-detail escalation lane for fine-grained recall — achieves 87.66% on LoCoMo under the strictest comparison standard available: the prior SOTA system’s own protocol, reproduced and re-judged in-harness. The category structure of the result supports the central design thesis: no single memory representation wins long-term conversational memory; a substrate that layers several, each rendered in its place, does. All code, including the benchmark harness and per-question artifacts, is open source at github.com/marolinik/hive-mind — the full winning-stack parity port is merged to master (CI green, 654/654 tests), so the public repository reproduces the configuration reported here.</w:t>
+        <w:t xml:space="preserve">A layered, fully local memory substrate — profiles for synthesis, write-time-dated episodic timelines for temporal anchoring, hybrid retrieval with reranking for relevance, and a verbatim raw-detail escalation lane for fine-grained recall — achieves 86.49% on LoCoMo under the strictest comparison standard available: the prior SOTA system’s own protocol, reproduced and re-judged in-harness. The category structure of the result supports the central design thesis: no single memory representation wins long-term conversational memory; a substrate that layers several, each rendered in its place, does. All code, including the benchmark harness and per-question artifacts, is open source at github.com/marolinik/hive-mind — the full winning-stack parity port is merged to master (CI green, 654/654 tests), so the public repository reproduces the configuration reported here.</w:t>
       </w:r>
     </w:p>
     <w:p>

</xml_diff>